<commit_message>
docs: pivot sprint 11 to dedup recovery
</commit_message>
<xml_diff>
--- a/docs/SPRINT_11_14_GAMEPLAN_2026-04-06.docx
+++ b/docs/SPRINT_11_14_GAMEPLAN_2026-04-06.docx
@@ -18,12 +18,12 @@
     </w:p>
     <w:p>
       <w:r>
-        <w:t>Prepared during: Sprint 10 closeout and QA handoff</w:t>
+        <w:t>Prepared during: Sprint 10 closeout after the dedup recovery issue was surfaced</w:t>
       </w:r>
     </w:p>
     <w:p>
       <w:r>
-        <w:t>Purpose: Next four-sprint plan after the isolated Sprint 9/10 path reached a full 25/25/25/25 golden pass.</w:t>
+        <w:t>Purpose: Replace the previous latency-first next-sprint plan with a recovery-first plan.</w:t>
       </w:r>
     </w:p>
     <w:p/>
@@ -38,260 +38,364 @@
         <w:pStyle w:val="Heading2"/>
       </w:pPr>
       <w:r>
-        <w:t>Current-State Summary</w:t>
+        <w:t>Why The Plan Changed</w:t>
       </w:r>
     </w:p>
     <w:p/>
     <w:p>
-      <w:pPr>
-        <w:pStyle w:val="ListBullet"/>
-      </w:pPr>
       <w:r>
-        <w:t>The isolated Sprint 9 demo path is now golden-green:</w:t>
-      </w:r>
-    </w:p>
-    <w:p>
-      <w:pPr>
-        <w:pStyle w:val="ListBullet"/>
-      </w:pPr>
-      <w:r>
-        <w:t>routing `25/25`</w:t>
-      </w:r>
-    </w:p>
-    <w:p>
-      <w:pPr>
-        <w:pStyle w:val="ListBullet"/>
-      </w:pPr>
-      <w:r>
-        <w:t>retrieval `25/25`</w:t>
-      </w:r>
-    </w:p>
-    <w:p>
-      <w:pPr>
-        <w:pStyle w:val="ListBullet"/>
-      </w:pPr>
-      <w:r>
-        <w:t>generation `25/25`</w:t>
-      </w:r>
-    </w:p>
-    <w:p>
-      <w:pPr>
-        <w:pStyle w:val="ListBullet"/>
-      </w:pPr>
-      <w:r>
-        <w:t>confidence `25/25`</w:t>
-      </w:r>
-    </w:p>
-    <w:p>
-      <w:pPr>
-        <w:pStyle w:val="ListBullet"/>
-      </w:pPr>
-      <w:r>
-        <w:t>Deterministic table recovery is now available for row-shaped spreadsheet fragments.</w:t>
-      </w:r>
-    </w:p>
-    <w:p>
-      <w:pPr>
-        <w:pStyle w:val="ListBullet"/>
-      </w:pPr>
-      <w:r>
-        <w:t>Full-pipeline eval scoring now reflects the actual routed retrieval context.</w:t>
-      </w:r>
-    </w:p>
-    <w:p>
-      <w:pPr>
-        <w:pStyle w:val="ListBullet"/>
-      </w:pPr>
-      <w:r>
-        <w:t>The main remaining weakness is latency, not correctness.</w:t>
+        <w:t>The Sprint 9/10 isolated path is functionally green, but a more serious economics problem was discovered:</w:t>
       </w:r>
     </w:p>
     <w:p/>
     <w:p>
       <w:pPr>
-        <w:spacing w:after="120"/>
-      </w:pPr>
+        <w:pStyle w:val="ListBullet"/>
+      </w:pPr>
+      <w:r>
+        <w:t>roughly five weeks were spent downloading and chunking the current corpus</w:t>
+      </w:r>
     </w:p>
-    <w:p/>
     <w:p>
       <w:pPr>
-        <w:pStyle w:val="Heading2"/>
+        <w:pStyle w:val="ListBullet"/>
       </w:pPr>
       <w:r>
-        <w:t>Current Research Notes</w:t>
+        <w:t>the current index footprint is about `170 GB`</w:t>
+      </w:r>
+    </w:p>
+    <w:p>
+      <w:pPr>
+        <w:pStyle w:val="ListBullet"/>
+      </w:pPr>
+      <w:r>
+        <w:t>a large share of the source set appears to be cross-format near-duplicates:</w:t>
+      </w:r>
+    </w:p>
+    <w:p>
+      <w:pPr>
+        <w:pStyle w:val="ListBullet"/>
+      </w:pPr>
+      <w:r>
+        <w:t>`DOC` / `DOCX` and `PDF`</w:t>
+      </w:r>
+    </w:p>
+    <w:p>
+      <w:pPr>
+        <w:pStyle w:val="ListBullet"/>
+      </w:pPr>
+      <w:r>
+        <w:t>signed variants</w:t>
+      </w:r>
+    </w:p>
+    <w:p>
+      <w:pPr>
+        <w:pStyle w:val="ListBullet"/>
+      </w:pPr>
+      <w:r>
+        <w:t>lightly edited exports</w:t>
+      </w:r>
+    </w:p>
+    <w:p>
+      <w:pPr>
+        <w:pStyle w:val="ListBullet"/>
+      </w:pPr>
+      <w:r>
+        <w:t>document families that differ by only a few lines</w:t>
       </w:r>
     </w:p>
     <w:p/>
     <w:p>
-      <w:pPr>
-        <w:pStyle w:val="Heading3"/>
-      </w:pPr>
       <w:r>
-        <w:t>Ollama</w:t>
+        <w:t>This means the expensive work is happening too late. Exact file-hash dedup was not enough, and chunk-level dedup only catches the problem after parsing, chunking, embedding, and often extraction have already been paid for.</w:t>
       </w:r>
     </w:p>
     <w:p/>
     <w:p>
-      <w:pPr>
-        <w:pStyle w:val="ListBullet"/>
-      </w:pPr>
       <w:r>
-        <w:t>OpenAI-compatible clients should point at a `/v1/` base URL.</w:t>
-      </w:r>
-    </w:p>
-    <w:p>
-      <w:pPr>
-        <w:pStyle w:val="ListBullet"/>
-      </w:pPr>
-      <w:r>
-        <w:t>Source: https://docs.ollama.com/api/openai-compatibility</w:t>
-      </w:r>
-    </w:p>
-    <w:p>
-      <w:pPr>
-        <w:pStyle w:val="ListBullet"/>
-      </w:pPr>
-      <w:r>
-        <w:t>Default local API base is `http://localhost:11434/api`, and custom local base URLs remain a first-class pattern.</w:t>
-      </w:r>
-    </w:p>
-    <w:p>
-      <w:pPr>
-        <w:pStyle w:val="ListBullet"/>
-      </w:pPr>
-      <w:r>
-        <w:t>Source: https://docs.ollama.com/api/introduction</w:t>
-      </w:r>
-    </w:p>
-    <w:p>
-      <w:pPr>
-        <w:pStyle w:val="ListBullet"/>
-      </w:pPr>
-      <w:r>
-        <w:t>`keep_alive` can keep models hot in memory or unload them immediately; this is the obvious next lever for warm-path latency.</w:t>
-      </w:r>
-    </w:p>
-    <w:p>
-      <w:pPr>
-        <w:pStyle w:val="ListBullet"/>
-      </w:pPr>
-      <w:r>
-        <w:t>Source: https://docs.ollama.com/faq</w:t>
+        <w:t>The new immediate priority is a recovery preprocessing stage ahead of re-chunking.</w:t>
       </w:r>
     </w:p>
     <w:p/>
     <w:p>
       <w:pPr>
-        <w:pStyle w:val="Heading3"/>
+        <w:spacing w:after="120"/>
+      </w:pPr>
+    </w:p>
+    <w:p/>
+    <w:p>
+      <w:pPr>
+        <w:pStyle w:val="Heading2"/>
       </w:pPr>
       <w:r>
-        <w:t>LanceDB</w:t>
+        <w:t>Current Decision</w:t>
       </w:r>
     </w:p>
     <w:p/>
     <w:p>
-      <w:pPr>
-        <w:pStyle w:val="ListBullet"/>
-      </w:pPr>
       <w:r>
-        <w:t>For `IVF_PQ`, LanceDB recommends keeping auto-tuned `nprobes` by default and only increasing it when recall is insufficient.</w:t>
-      </w:r>
-    </w:p>
-    <w:p>
-      <w:pPr>
-        <w:pStyle w:val="ListBullet"/>
-      </w:pPr>
-      <w:r>
-        <w:t>Source: https://docs.lancedb.com/indexing/vector-index</w:t>
-      </w:r>
-    </w:p>
-    <w:p>
-      <w:pPr>
-        <w:pStyle w:val="ListBullet"/>
-      </w:pPr>
-      <w:r>
-        <w:t>`refine_factor` reranks extra candidates in memory and is the main recall/latency tradeoff knob during search.</w:t>
-      </w:r>
-    </w:p>
-    <w:p>
-      <w:pPr>
-        <w:pStyle w:val="ListBullet"/>
-      </w:pPr>
-      <w:r>
-        <w:t>Source: https://docs.lancedb.com/indexing/vector-index</w:t>
-      </w:r>
-    </w:p>
-    <w:p>
-      <w:pPr>
-        <w:pStyle w:val="ListBullet"/>
-      </w:pPr>
-      <w:r>
-        <w:t>LanceDB OSS supports manual GPU indexing for `IVF_PQ` using the Python SDK.</w:t>
-      </w:r>
-    </w:p>
-    <w:p>
-      <w:pPr>
-        <w:pStyle w:val="ListBullet"/>
-      </w:pPr>
-      <w:r>
-        <w:t>Source: https://docs.lancedb.com/indexing/gpu-indexing</w:t>
+        <w:rPr>
+          <w:b/>
+        </w:rPr>
+        <w:t>Sprint 11 becomes a Recovery Dedup sprint.</w:t>
       </w:r>
     </w:p>
     <w:p/>
     <w:p>
-      <w:pPr>
-        <w:pStyle w:val="Heading3"/>
-      </w:pPr>
       <w:r>
-        <w:t>OpenAI Eval / Agent Safety Guidance</w:t>
+        <w:t>The goal is not to debate whether the current index is usable. It is.</w:t>
+      </w:r>
+    </w:p>
+    <w:p>
+      <w:r>
+        <w:t>The goal is to stop rebuilding the next large index from a bloated source set.</w:t>
       </w:r>
     </w:p>
     <w:p/>
     <w:p>
-      <w:pPr>
-        <w:pStyle w:val="ListBullet"/>
-      </w:pPr>
       <w:r>
-        <w:t>Use structured outputs between stages to constrain model behavior and data flow.</w:t>
-      </w:r>
-    </w:p>
-    <w:p>
-      <w:pPr>
-        <w:pStyle w:val="ListBullet"/>
-      </w:pPr>
-      <w:r>
-        <w:t>Run trace graders and evals at the stage level, not just end to end.</w:t>
-      </w:r>
-    </w:p>
-    <w:p>
-      <w:pPr>
-        <w:pStyle w:val="ListBullet"/>
-      </w:pPr>
-      <w:r>
-        <w:t>Harden tool use and prompt-injection boundaries explicitly.</w:t>
-      </w:r>
-    </w:p>
-    <w:p>
-      <w:pPr>
-        <w:pStyle w:val="ListBullet"/>
-      </w:pPr>
-      <w:r>
-        <w:t>Source: https://developers.openai.com/api/docs/guides/agent-builder-safety</w:t>
+        <w:t>The working assumption is:</w:t>
       </w:r>
     </w:p>
     <w:p/>
     <w:p>
       <w:pPr>
-        <w:spacing w:after="120"/>
-      </w:pPr>
+        <w:pStyle w:val="ListBullet"/>
+      </w:pPr>
+      <w:r>
+        <w:t>HybridRAG3 can likely rebuild a cleaned corpus in `3-5 days`</w:t>
+      </w:r>
+    </w:p>
+    <w:p>
+      <w:pPr>
+        <w:pStyle w:val="ListBullet"/>
+      </w:pPr>
+      <w:r>
+        <w:t>the real leverage is preprocessing the source tree into a canonical file set</w:t>
+      </w:r>
+    </w:p>
+    <w:p>
+      <w:pPr>
+        <w:pStyle w:val="ListBullet"/>
+      </w:pPr>
+      <w:r>
+        <w:t>the old exact-hash skip machinery still matters, but it must sit behind a better recovery-stage dedup pass</w:t>
+      </w:r>
     </w:p>
     <w:p/>
     <w:p>
       <w:pPr>
+        <w:spacing w:after="120"/>
+      </w:pPr>
+    </w:p>
+    <w:p/>
+    <w:p>
+      <w:pPr>
         <w:pStyle w:val="Heading2"/>
       </w:pPr>
       <w:r>
-        <w:t>Sprint 11: Latency Hardening</w:t>
+        <w:t>Research Notes Driving The Plan</w:t>
+      </w:r>
+    </w:p>
+    <w:p/>
+    <w:p>
+      <w:pPr>
+        <w:pStyle w:val="Heading3"/>
+      </w:pPr>
+      <w:r>
+        <w:t>Exact And Near-Duplicate Detection</w:t>
+      </w:r>
+    </w:p>
+    <w:p/>
+    <w:p>
+      <w:pPr>
+        <w:pStyle w:val="ListBullet"/>
+      </w:pPr>
+      <w:r>
+        <w:t>Google documents SimHash-based near-duplicate detection as a web-scale pattern for large repositories:</w:t>
+      </w:r>
+    </w:p>
+    <w:p>
+      <w:pPr>
+        <w:pStyle w:val="ListBullet"/>
+      </w:pPr>
+      <w:r>
+        <w:t>https://research.google/pubs/detecting-near-duplicates-for-web-crawling/</w:t>
+      </w:r>
+    </w:p>
+    <w:p>
+      <w:pPr>
+        <w:pStyle w:val="ListBullet"/>
+      </w:pPr>
+      <w:r>
+        <w:t>`datasketch` documents MinHash LSH for Jaccard-threshold duplicate search:</w:t>
+      </w:r>
+    </w:p>
+    <w:p>
+      <w:pPr>
+        <w:pStyle w:val="ListBullet"/>
+      </w:pPr>
+      <w:r>
+        <w:t>https://ekzhu.com/datasketch/lsh.html</w:t>
+      </w:r>
+    </w:p>
+    <w:p>
+      <w:pPr>
+        <w:pStyle w:val="ListBullet"/>
+      </w:pPr>
+      <w:r>
+        <w:t>`datasketch` also documents `MinHashLSHEnsemble` for **containment**, which is the better fit when one version contains almost all of another plus extra pages or signatures:</w:t>
+      </w:r>
+    </w:p>
+    <w:p>
+      <w:pPr>
+        <w:pStyle w:val="ListBullet"/>
+      </w:pPr>
+      <w:r>
+        <w:t>https://ekzhu.com/datasketch/lshensemble.html</w:t>
+      </w:r>
+    </w:p>
+    <w:p>
+      <w:pPr>
+        <w:pStyle w:val="ListBullet"/>
+      </w:pPr>
+      <w:r>
+        <w:t>OpenSearch exposes MinHash as a built-in similarity filter and explicitly frames it as document-similarity detection:</w:t>
+      </w:r>
+    </w:p>
+    <w:p>
+      <w:pPr>
+        <w:pStyle w:val="ListBullet"/>
+      </w:pPr>
+      <w:r>
+        <w:t>https://docs.opensearch.org/latest/analyzers/token-filters/min-hash/</w:t>
+      </w:r>
+    </w:p>
+    <w:p/>
+    <w:p>
+      <w:pPr>
+        <w:pStyle w:val="Heading3"/>
+      </w:pPr>
+      <w:r>
+        <w:t>Practical Large-Scale Conflation</w:t>
+      </w:r>
+    </w:p>
+    <w:p/>
+    <w:p>
+      <w:pPr>
+        <w:pStyle w:val="ListBullet"/>
+      </w:pPr>
+      <w:r>
+        <w:t>Microsoft research describes a scalable shingling-first candidate-generation approach:</w:t>
+      </w:r>
+    </w:p>
+    <w:p>
+      <w:pPr>
+        <w:pStyle w:val="ListBullet"/>
+      </w:pPr>
+      <w:r>
+        <w:t>build shingles</w:t>
+      </w:r>
+    </w:p>
+    <w:p>
+      <w:pPr>
+        <w:pStyle w:val="ListBullet"/>
+      </w:pPr>
+      <w:r>
+        <w:t>cluster candidates by shared shingles</w:t>
+      </w:r>
+    </w:p>
+    <w:p>
+      <w:pPr>
+        <w:pStyle w:val="ListBullet"/>
+      </w:pPr>
+      <w:r>
+        <w:t>avoid comparing every document with every other document</w:t>
+      </w:r>
+    </w:p>
+    <w:p>
+      <w:pPr>
+        <w:pStyle w:val="ListBullet"/>
+      </w:pPr>
+      <w:r>
+        <w:t>https://www.microsoft.com/en-us/research/wp-content/uploads/2016/02/submission-v1.pdf</w:t>
+      </w:r>
+    </w:p>
+    <w:p/>
+    <w:p>
+      <w:pPr>
+        <w:pStyle w:val="Heading3"/>
+      </w:pPr>
+      <w:r>
+        <w:t>Practical Implication For This Project</w:t>
+      </w:r>
+    </w:p>
+    <w:p/>
+    <w:p>
+      <w:r>
+        <w:t>The recovery stage should follow a layered pattern:</w:t>
+      </w:r>
+    </w:p>
+    <w:p/>
+    <w:p>
+      <w:pPr>
+        <w:pStyle w:val="ListNumber"/>
+      </w:pPr>
+      <w:r>
+        <w:t>**strict normalization + exact normalized hash**</w:t>
+      </w:r>
+    </w:p>
+    <w:p>
+      <w:pPr>
+        <w:pStyle w:val="ListNumber"/>
+      </w:pPr>
+      <w:r>
+        <w:t>**same-family near-duplicate comparison**</w:t>
+      </w:r>
+    </w:p>
+    <w:p>
+      <w:pPr>
+        <w:pStyle w:val="ListNumber"/>
+      </w:pPr>
+      <w:r>
+        <w:t>**containment-aware matching for appended or signed variants**</w:t>
+      </w:r>
+    </w:p>
+    <w:p>
+      <w:pPr>
+        <w:pStyle w:val="ListNumber"/>
+      </w:pPr>
+      <w:r>
+        <w:t>**canonical representative selection**</w:t>
+      </w:r>
+    </w:p>
+    <w:p>
+      <w:pPr>
+        <w:pStyle w:val="ListNumber"/>
+      </w:pPr>
+      <w:r>
+        <w:t>**audit trail and recovery manifest**</w:t>
+      </w:r>
+    </w:p>
+    <w:p/>
+    <w:p>
+      <w:r>
+        <w:t>That is the industry-shaped version of this problem, and it fits the current architecture well.</w:t>
+      </w:r>
+    </w:p>
+    <w:p/>
+    <w:p>
+      <w:pPr>
+        <w:spacing w:after="120"/>
+      </w:pPr>
+    </w:p>
+    <w:p/>
+    <w:p>
+      <w:pPr>
+        <w:pStyle w:val="Heading2"/>
+      </w:pPr>
+      <w:r>
+        <w:t>Sprint 11: Recovery Dedup Stage</w:t>
       </w:r>
     </w:p>
     <w:p/>
@@ -306,7 +410,7 @@
     <w:p/>
     <w:p>
       <w:r>
-        <w:t>Reduce warm-path latency without regressing the newly green golden results.</w:t>
+        <w:t>Create a new preprocessing stage in CorpusForge that builds a canonical source list before chunking so the next rebuild is materially smaller and cheaper.</w:t>
       </w:r>
     </w:p>
     <w:p/>
@@ -315,88 +419,125 @@
         <w:pStyle w:val="Heading3"/>
       </w:pPr>
       <w:r>
-        <w:t>Work Items</w:t>
+        <w:t>Slices</w:t>
       </w:r>
     </w:p>
     <w:p/>
     <w:p>
-      <w:pPr>
-        <w:pStyle w:val="ListNumber"/>
-      </w:pPr>
       <w:r>
-        <w:t>Add Ollama model prewarm / keep-alive controls for the dedicated demo endpoint.</w:t>
+        <w:rPr>
+          <w:rFonts w:ascii="Consolas" w:hAnsi="Consolas"/>
+          <w:sz w:val="20"/>
+        </w:rPr>
+        <w:t>Slice  |  Work  |  Status</w:t>
       </w:r>
     </w:p>
     <w:p>
-      <w:pPr>
-        <w:pStyle w:val="ListNumber"/>
-      </w:pPr>
       <w:r>
-        <w:t>Separate cold-start latency from steady-state latency in the profiler output.</w:t>
+        <w:rPr>
+          <w:rFonts w:ascii="Consolas" w:hAnsi="Consolas"/>
+          <w:sz w:val="20"/>
+        </w:rPr>
+        <w:t>11.1  |  Recovery-stage design doc: cause, economics, recovery sequence, operator workflow  |  TODO</w:t>
       </w:r>
     </w:p>
     <w:p>
-      <w:pPr>
-        <w:pStyle w:val="ListNumber"/>
-      </w:pPr>
       <w:r>
-        <w:t>Benchmark router-only and generation-only latency independently.</w:t>
+        <w:rPr>
+          <w:rFonts w:ascii="Consolas" w:hAnsi="Consolas"/>
+          <w:sz w:val="20"/>
+        </w:rPr>
+        <w:t>11.2  |  Focused file discovery for `PDF`, `DOC`, `DOCX` only  |  DONE</w:t>
       </w:r>
     </w:p>
     <w:p>
-      <w:pPr>
-        <w:pStyle w:val="ListNumber"/>
-      </w:pPr>
       <w:r>
-        <w:t>Tune LanceDB search parameters only if recall remains stable:</w:t>
+        <w:rPr>
+          <w:rFonts w:ascii="Consolas" w:hAnsi="Consolas"/>
+          <w:sz w:val="20"/>
+        </w:rPr>
+        <w:t>11.3  |  Normalized extracted-text fingerprinting for cross-format exact matches  |  DONE</w:t>
       </w:r>
     </w:p>
     <w:p>
-      <w:pPr>
-        <w:pStyle w:val="ListBullet"/>
-      </w:pPr>
       <w:r>
-        <w:t>`nprobes`</w:t>
+        <w:rPr>
+          <w:rFonts w:ascii="Consolas" w:hAnsi="Consolas"/>
+          <w:sz w:val="20"/>
+        </w:rPr>
+        <w:t>11.4  |  Same-family near-duplicate comparison with containment-style scoring  |  DONE</w:t>
       </w:r>
     </w:p>
     <w:p>
-      <w:pPr>
-        <w:pStyle w:val="ListBullet"/>
-      </w:pPr>
       <w:r>
-        <w:t>`refine_factor`</w:t>
+        <w:rPr>
+          <w:rFonts w:ascii="Consolas" w:hAnsi="Consolas"/>
+          <w:sz w:val="20"/>
+        </w:rPr>
+        <w:t>11.5  |  Persistent recovery outputs: sqlite index, canonical file list, duplicate audit  |  DONE</w:t>
       </w:r>
     </w:p>
     <w:p>
-      <w:pPr>
-        <w:pStyle w:val="ListNumber"/>
-      </w:pPr>
       <w:r>
-        <w:t>Add a latency gate report for:</w:t>
+        <w:rPr>
+          <w:rFonts w:ascii="Consolas" w:hAnsi="Consolas"/>
+          <w:sz w:val="20"/>
+        </w:rPr>
+        <w:t>11.6  |  Pipeline consume path: `run_pipeline.py --input-list &lt;canonical_files.txt&gt;`  |  DONE</w:t>
       </w:r>
     </w:p>
     <w:p>
-      <w:pPr>
-        <w:pStyle w:val="ListBullet"/>
-      </w:pPr>
       <w:r>
-        <w:t>cold P50 / P95</w:t>
+        <w:rPr>
+          <w:rFonts w:ascii="Consolas" w:hAnsi="Consolas"/>
+          <w:sz w:val="20"/>
+        </w:rPr>
+        <w:t>11.7  |  Recovery GUI for non-programmer operation  |  DONE</w:t>
       </w:r>
     </w:p>
     <w:p>
-      <w:pPr>
-        <w:pStyle w:val="ListBullet"/>
-      </w:pPr>
       <w:r>
-        <w:t>warm P50 / P95</w:t>
+        <w:rPr>
+          <w:rFonts w:ascii="Consolas" w:hAnsi="Consolas"/>
+          <w:sz w:val="20"/>
+        </w:rPr>
+        <w:t>11.8  |  Pilot run on a controlled folder slice, measure duplicate reduction and false positives  |  TODO</w:t>
       </w:r>
     </w:p>
     <w:p>
-      <w:pPr>
-        <w:pStyle w:val="ListBullet"/>
-      </w:pPr>
       <w:r>
-        <w:t>per-stage averages</w:t>
+        <w:rPr>
+          <w:rFonts w:ascii="Consolas" w:hAnsi="Consolas"/>
+          <w:sz w:val="20"/>
+        </w:rPr>
+        <w:t>11.9  |  Canonical-choice review rules: prefer best parse quality and best editable source  |  TODO</w:t>
+      </w:r>
+    </w:p>
+    <w:p>
+      <w:r>
+        <w:rPr>
+          <w:rFonts w:ascii="Consolas" w:hAnsi="Consolas"/>
+          <w:sz w:val="20"/>
+        </w:rPr>
+        <w:t>11.10  |  Signed/exported variant handling: appended pages, cover sheets, signature blocks  |  TODO</w:t>
+      </w:r>
+    </w:p>
+    <w:p>
+      <w:r>
+        <w:rPr>
+          <w:rFonts w:ascii="Consolas" w:hAnsi="Consolas"/>
+          <w:sz w:val="20"/>
+        </w:rPr>
+        <w:t>11.11  |  Recovery QA bundle: duplicate samples, false-positive audit, operator commands  |  TODO</w:t>
+      </w:r>
+    </w:p>
+    <w:p>
+      <w:r>
+        <w:rPr>
+          <w:rFonts w:ascii="Consolas" w:hAnsi="Consolas"/>
+          <w:sz w:val="20"/>
+        </w:rPr>
+        <w:t>11.12  |  Freeze the rebuild input list for the next corpus rebuild  |  TODO</w:t>
       </w:r>
     </w:p>
     <w:p/>
@@ -414,7 +555,7 @@
         <w:pStyle w:val="ListBullet"/>
       </w:pPr>
       <w:r>
-        <w:t>Warm demo-path average latency is materially lower than the current ~15s full-eval mean.</w:t>
+        <w:t>Recovery stage produces:</w:t>
       </w:r>
     </w:p>
     <w:p>
@@ -422,22 +563,148 @@
         <w:pStyle w:val="ListBullet"/>
       </w:pPr>
       <w:r>
-        <w:t>Golden correctness remains at `25/25/25/25`.</w:t>
+        <w:t>`document_dedup.sqlite3`</w:t>
+      </w:r>
+    </w:p>
+    <w:p>
+      <w:pPr>
+        <w:pStyle w:val="ListBullet"/>
+      </w:pPr>
+      <w:r>
+        <w:t>`canonical_files.txt`</w:t>
+      </w:r>
+    </w:p>
+    <w:p>
+      <w:pPr>
+        <w:pStyle w:val="ListBullet"/>
+      </w:pPr>
+      <w:r>
+        <w:t>`duplicate_files.jsonl`</w:t>
+      </w:r>
+    </w:p>
+    <w:p>
+      <w:pPr>
+        <w:pStyle w:val="ListBullet"/>
+      </w:pPr>
+      <w:r>
+        <w:t>`dedup_report.json`</w:t>
+      </w:r>
+    </w:p>
+    <w:p>
+      <w:pPr>
+        <w:pStyle w:val="ListBullet"/>
+      </w:pPr>
+      <w:r>
+        <w:t>Canonical file list can be fed directly into CorpusForge reprocessing</w:t>
+      </w:r>
+    </w:p>
+    <w:p>
+      <w:pPr>
+        <w:pStyle w:val="ListBullet"/>
+      </w:pPr>
+      <w:r>
+        <w:t>Pilot run shows a meaningful reduction in file count before chunking</w:t>
+      </w:r>
+    </w:p>
+    <w:p>
+      <w:pPr>
+        <w:pStyle w:val="ListBullet"/>
+      </w:pPr>
+      <w:r>
+        <w:t>False positives are reviewed on a sample before full rebuild approval</w:t>
       </w:r>
     </w:p>
     <w:p/>
     <w:p>
       <w:pPr>
-        <w:spacing w:after="120"/>
-      </w:pPr>
+        <w:pStyle w:val="Heading3"/>
+      </w:pPr>
+      <w:r>
+        <w:t>Key Commands</w:t>
+      </w:r>
     </w:p>
     <w:p/>
     <w:p>
       <w:pPr>
+        <w:ind w:left="432"/>
+      </w:pPr>
+      <w:r>
+        <w:rPr>
+          <w:rFonts w:ascii="Consolas" w:hAnsi="Consolas"/>
+          <w:color w:val="282828"/>
+          <w:sz w:val="18"/>
+        </w:rPr>
+        <w:t>cd C:\CorpusForge</w:t>
+        <w:br/>
+        <w:t>.venv\Scripts\python.exe scripts\build_document_dedup_index.py --input C:\Path\To\Source</w:t>
+      </w:r>
+    </w:p>
+    <w:p/>
+    <w:p>
+      <w:pPr>
+        <w:ind w:left="432"/>
+      </w:pPr>
+      <w:r>
+        <w:rPr>
+          <w:rFonts w:ascii="Consolas" w:hAnsi="Consolas"/>
+          <w:color w:val="282828"/>
+          <w:sz w:val="18"/>
+        </w:rPr>
+        <w:t>cd C:\CorpusForge</w:t>
+        <w:br/>
+        <w:t>.venv\Scripts\python.exe scripts\run_pipeline.py --input-list C:\CorpusForge\data\dedup\document_dedup_YYYYMMDD_HHMMSS\canonical_files.txt</w:t>
+      </w:r>
+    </w:p>
+    <w:p/>
+    <w:p>
+      <w:pPr>
+        <w:pStyle w:val="Heading3"/>
+      </w:pPr>
+      <w:r>
+        <w:t>GUI Path</w:t>
+      </w:r>
+    </w:p>
+    <w:p/>
+    <w:p>
+      <w:r>
+        <w:t>Use the normal launcher with a recovery switch:</w:t>
+      </w:r>
+    </w:p>
+    <w:p/>
+    <w:p>
+      <w:pPr>
+        <w:ind w:left="432"/>
+      </w:pPr>
+      <w:r>
+        <w:rPr>
+          <w:rFonts w:ascii="Consolas" w:hAnsi="Consolas"/>
+          <w:color w:val="282828"/>
+          <w:sz w:val="18"/>
+        </w:rPr>
+        <w:t>cd C:\CorpusForge</w:t>
+        <w:br/>
+        <w:t>start_corpusforge.bat --dedup</w:t>
+      </w:r>
+    </w:p>
+    <w:p/>
+    <w:p>
+      <w:r>
+        <w:t>This opens the dedicated recovery GUI instead of the normal pipeline monitor.</w:t>
+      </w:r>
+    </w:p>
+    <w:p/>
+    <w:p>
+      <w:pPr>
+        <w:spacing w:after="120"/>
+      </w:pPr>
+    </w:p>
+    <w:p/>
+    <w:p>
+      <w:pPr>
         <w:pStyle w:val="Heading2"/>
       </w:pPr>
       <w:r>
-        <w:t>Sprint 12: Broader Structured Promotion</w:t>
+        <w:t>Sprint 12: Canonical Rebuild</w:t>
       </w:r>
     </w:p>
     <w:p/>
@@ -452,7 +719,7 @@
     <w:p/>
     <w:p>
       <w:r>
-        <w:t>Promote deterministic and LLM-backed structured extraction beyond the current demo slice.</w:t>
+        <w:t>Re-chunk and re-embed from the canonical file list instead of the raw source tree.</w:t>
       </w:r>
     </w:p>
     <w:p/>
@@ -461,7 +728,7 @@
         <w:pStyle w:val="Heading3"/>
       </w:pPr>
       <w:r>
-        <w:t>Work Items</w:t>
+        <w:t>Slices</w:t>
       </w:r>
     </w:p>
     <w:p/>
@@ -470,7 +737,7 @@
         <w:pStyle w:val="ListNumber"/>
       </w:pPr>
       <w:r>
-        <w:t>Run a larger isolated structured promotion on a controlled corpus slice.</w:t>
+        <w:t>Run CorpusForge on the canonical file list.</w:t>
       </w:r>
     </w:p>
     <w:p>
@@ -478,23 +745,23 @@
         <w:pStyle w:val="ListNumber"/>
       </w:pPr>
       <w:r>
-        <w:t>Add source-level reset/idempotency commands for:</w:t>
+        <w:t>Build a fresh export package from the reduced corpus.</w:t>
       </w:r>
     </w:p>
     <w:p>
       <w:pPr>
-        <w:pStyle w:val="ListBullet"/>
+        <w:pStyle w:val="ListNumber"/>
       </w:pPr>
       <w:r>
-        <w:t>entities</w:t>
+        <w:t>Import into a fresh V2 LanceDB path.</w:t>
       </w:r>
     </w:p>
     <w:p>
       <w:pPr>
-        <w:pStyle w:val="ListBullet"/>
+        <w:pStyle w:val="ListNumber"/>
       </w:pPr>
       <w:r>
-        <w:t>relationships</w:t>
+        <w:t>Compare:</w:t>
       </w:r>
     </w:p>
     <w:p>
@@ -502,15 +769,15 @@
         <w:pStyle w:val="ListBullet"/>
       </w:pPr>
       <w:r>
-        <w:t>extracted tables</w:t>
+        <w:t>source file count</w:t>
       </w:r>
     </w:p>
     <w:p>
       <w:pPr>
-        <w:pStyle w:val="ListNumber"/>
+        <w:pStyle w:val="ListBullet"/>
       </w:pPr>
       <w:r>
-        <w:t>Expand deterministic extractors for:</w:t>
+        <w:t>chunk count</w:t>
       </w:r>
     </w:p>
     <w:p>
@@ -518,7 +785,7 @@
         <w:pStyle w:val="ListBullet"/>
       </w:pPr>
       <w:r>
-        <w:t>spreadsheet fragments</w:t>
+        <w:t>index size</w:t>
       </w:r>
     </w:p>
     <w:p>
@@ -526,7 +793,7 @@
         <w:pStyle w:val="ListBullet"/>
       </w:pPr>
       <w:r>
-        <w:t>repeated report tables</w:t>
+        <w:t>import time</w:t>
       </w:r>
     </w:p>
     <w:p>
@@ -534,7 +801,7 @@
         <w:pStyle w:val="ListBullet"/>
       </w:pPr>
       <w:r>
-        <w:t>contact blocks</w:t>
+        <w:t>entity-extraction candidate volume</w:t>
       </w:r>
     </w:p>
     <w:p>
@@ -542,7 +809,7 @@
         <w:pStyle w:val="ListNumber"/>
       </w:pPr>
       <w:r>
-        <w:t>Validate structured-store counts and duplicate behavior after reruns.</w:t>
+        <w:t>Preserve the old index until the rebuilt path clears QA.</w:t>
       </w:r>
     </w:p>
     <w:p/>
@@ -560,7 +827,7 @@
         <w:pStyle w:val="ListBullet"/>
       </w:pPr>
       <w:r>
-        <w:t>Structured promotion covers a materially larger source slice than Sprint 10.</w:t>
+        <w:t>Fresh reduced corpus export exists</w:t>
       </w:r>
     </w:p>
     <w:p>
@@ -568,7 +835,23 @@
         <w:pStyle w:val="ListBullet"/>
       </w:pPr>
       <w:r>
-        <w:t>Rerunning promotion on the same slice is clean and documented.</w:t>
+        <w:t>Fresh reduced V2 index exists</w:t>
+      </w:r>
+    </w:p>
+    <w:p>
+      <w:pPr>
+        <w:pStyle w:val="ListBullet"/>
+      </w:pPr>
+      <w:r>
+        <w:t>Before/after metrics are documented</w:t>
+      </w:r>
+    </w:p>
+    <w:p>
+      <w:pPr>
+        <w:pStyle w:val="ListBullet"/>
+      </w:pPr>
+      <w:r>
+        <w:t>Old index remains available as fallback</w:t>
       </w:r>
     </w:p>
     <w:p/>
@@ -583,7 +866,7 @@
         <w:pStyle w:val="Heading2"/>
       </w:pPr>
       <w:r>
-        <w:t>Sprint 13: Eval And Trace Hardening</w:t>
+        <w:t>Sprint 13: Structured Promotion On The Rebuilt Corpus</w:t>
       </w:r>
     </w:p>
     <w:p/>
@@ -598,7 +881,7 @@
     <w:p/>
     <w:p>
       <w:r>
-        <w:t>Make the QA harness more diagnostic and less dependent on manual triage.</w:t>
+        <w:t>Apply the structured-extraction work to the smaller rebuilt corpus so extraction cost and time are reduced at the source.</w:t>
       </w:r>
     </w:p>
     <w:p/>
@@ -607,7 +890,7 @@
         <w:pStyle w:val="Heading3"/>
       </w:pPr>
       <w:r>
-        <w:t>Work Items</w:t>
+        <w:t>Slices</w:t>
       </w:r>
     </w:p>
     <w:p/>
@@ -616,63 +899,31 @@
         <w:pStyle w:val="ListNumber"/>
       </w:pPr>
       <w:r>
-        <w:t>Add stage-level graders for:</w:t>
+        <w:t>Run structured extraction on the rebuilt corpus slice.</w:t>
       </w:r>
     </w:p>
     <w:p>
       <w:pPr>
-        <w:pStyle w:val="ListBullet"/>
+        <w:pStyle w:val="ListNumber"/>
       </w:pPr>
       <w:r>
-        <w:t>router</w:t>
+        <w:t>Measure extraction time savings versus the bloated corpus path.</w:t>
       </w:r>
     </w:p>
     <w:p>
       <w:pPr>
-        <w:pStyle w:val="ListBullet"/>
+        <w:pStyle w:val="ListNumber"/>
       </w:pPr>
       <w:r>
-        <w:t>retrieval context</w:t>
+        <w:t>Re-run golden eval and demo rehearsal on the rebuilt path.</w:t>
       </w:r>
     </w:p>
     <w:p>
       <w:pPr>
-        <w:pStyle w:val="ListBullet"/>
+        <w:pStyle w:val="ListNumber"/>
       </w:pPr>
       <w:r>
-        <w:t>generation</w:t>
-      </w:r>
-    </w:p>
-    <w:p>
-      <w:pPr>
-        <w:pStyle w:val="ListBullet"/>
-      </w:pPr>
-      <w:r>
-        <w:t>confidence</w:t>
-      </w:r>
-    </w:p>
-    <w:p>
-      <w:pPr>
-        <w:pStyle w:val="ListNumber"/>
-      </w:pPr>
-      <w:r>
-        <w:t>Save retrieval context snapshots per query in golden runs.</w:t>
-      </w:r>
-    </w:p>
-    <w:p>
-      <w:pPr>
-        <w:pStyle w:val="ListNumber"/>
-      </w:pPr>
-      <w:r>
-        <w:t>Add diff-friendly output for regressions between runs.</w:t>
-      </w:r>
-    </w:p>
-    <w:p>
-      <w:pPr>
-        <w:pStyle w:val="ListNumber"/>
-      </w:pPr>
-      <w:r>
-        <w:t>Add prompt-injection and tool-safety regression probes to the QA bundle.</w:t>
+        <w:t>Confirm that dedup did not remove required business content.</w:t>
       </w:r>
     </w:p>
     <w:p/>
@@ -690,7 +941,7 @@
         <w:pStyle w:val="ListBullet"/>
       </w:pPr>
       <w:r>
-        <w:t>Golden eval failures identify the failing stage directly.</w:t>
+        <w:t>Golden behavior remains acceptable on the rebuilt corpus</w:t>
       </w:r>
     </w:p>
     <w:p>
@@ -698,7 +949,15 @@
         <w:pStyle w:val="ListBullet"/>
       </w:pPr>
       <w:r>
-        <w:t>QA can compare two runs without manual JSON inspection.</w:t>
+        <w:t>Extraction volume is materially reduced</w:t>
+      </w:r>
+    </w:p>
+    <w:p>
+      <w:pPr>
+        <w:pStyle w:val="ListBullet"/>
+      </w:pPr>
+      <w:r>
+        <w:t>Retrieval correctness is not regressed by recovery-stage dedup</w:t>
       </w:r>
     </w:p>
     <w:p/>
@@ -713,7 +972,7 @@
         <w:pStyle w:val="Heading2"/>
       </w:pPr>
       <w:r>
-        <w:t>Sprint 14: Deployment Path And Operator Runbook</w:t>
+        <w:t>Sprint 14: Operator Hardening</w:t>
       </w:r>
     </w:p>
     <w:p/>
@@ -728,7 +987,7 @@
     <w:p/>
     <w:p>
       <w:r>
-        <w:t>Convert the isolated demo path into a repeatable operator workflow.</w:t>
+        <w:t>Make the recovery path safe for repeated use by a non-programmer operator.</w:t>
       </w:r>
     </w:p>
     <w:p/>
@@ -737,7 +996,7 @@
         <w:pStyle w:val="Heading3"/>
       </w:pPr>
       <w:r>
-        <w:t>Work Items</w:t>
+        <w:t>Slices</w:t>
       </w:r>
     </w:p>
     <w:p/>
@@ -746,31 +1005,55 @@
         <w:pStyle w:val="ListNumber"/>
       </w:pPr>
       <w:r>
-        <w:t>Refresh wheel bundles after the Sprint 11-13 changes.</w:t>
+        <w:t>One-button launcher guidance for:</w:t>
       </w:r>
     </w:p>
     <w:p>
       <w:pPr>
-        <w:pStyle w:val="ListNumber"/>
+        <w:pStyle w:val="ListBullet"/>
       </w:pPr>
       <w:r>
-        <w:t>Document dedicated Ollama startup, warmup, and smoke-check flows.</w:t>
+        <w:t>recovery dedup</w:t>
       </w:r>
     </w:p>
     <w:p>
       <w:pPr>
-        <w:pStyle w:val="ListNumber"/>
+        <w:pStyle w:val="ListBullet"/>
       </w:pPr>
       <w:r>
-        <w:t>Add one-button or one-command pre-demo validation.</w:t>
+        <w:t>canonical rebuild</w:t>
       </w:r>
     </w:p>
     <w:p>
       <w:pPr>
+        <w:pStyle w:val="ListBullet"/>
+      </w:pPr>
+      <w:r>
+        <w:t>smoke-check</w:t>
+      </w:r>
+    </w:p>
+    <w:p>
+      <w:pPr>
         <w:pStyle w:val="ListNumber"/>
       </w:pPr>
       <w:r>
-        <w:t>Decide whether the isolated demo path remains local-Ollama-only or needs a dual-path deployment recommendation.</w:t>
+        <w:t>Add clearer status text and operator guidance in the GUI.</w:t>
+      </w:r>
+    </w:p>
+    <w:p>
+      <w:pPr>
+        <w:pStyle w:val="ListNumber"/>
+      </w:pPr>
+      <w:r>
+        <w:t>Document stop/resume behavior and known limits.</w:t>
+      </w:r>
+    </w:p>
+    <w:p>
+      <w:pPr>
+        <w:pStyle w:val="ListNumber"/>
+      </w:pPr>
+      <w:r>
+        <w:t>Prepare a short runbook for work-machine execution.</w:t>
       </w:r>
     </w:p>
     <w:p/>
@@ -788,7 +1071,7 @@
         <w:pStyle w:val="ListBullet"/>
       </w:pPr>
       <w:r>
-        <w:t>A non-author can start the demo stack, warm it, and smoke-test it from the runbook alone.</w:t>
+        <w:t>A non-author can launch the recovery pass and understand what output to use next</w:t>
       </w:r>
     </w:p>
     <w:p>
@@ -796,7 +1079,71 @@
         <w:pStyle w:val="ListBullet"/>
       </w:pPr>
       <w:r>
-        <w:t>Deployment recommendation is documented with tradeoffs.</w:t>
+        <w:t>Recovery output can be handed directly to the rebuild path without shell scripting</w:t>
+      </w:r>
+    </w:p>
+    <w:p/>
+    <w:p>
+      <w:pPr>
+        <w:spacing w:after="120"/>
+      </w:pPr>
+    </w:p>
+    <w:p/>
+    <w:p>
+      <w:pPr>
+        <w:pStyle w:val="Heading2"/>
+      </w:pPr>
+      <w:r>
+        <w:t>Priority Order</w:t>
+      </w:r>
+    </w:p>
+    <w:p/>
+    <w:p>
+      <w:pPr>
+        <w:pStyle w:val="ListNumber"/>
+      </w:pPr>
+      <w:r>
+        <w:t>Build canonical source list</w:t>
+      </w:r>
+    </w:p>
+    <w:p>
+      <w:pPr>
+        <w:pStyle w:val="ListNumber"/>
+      </w:pPr>
+      <w:r>
+        <w:t>Review duplicate samples</w:t>
+      </w:r>
+    </w:p>
+    <w:p>
+      <w:pPr>
+        <w:pStyle w:val="ListNumber"/>
+      </w:pPr>
+      <w:r>
+        <w:t>Rebuild from canonical list</w:t>
+      </w:r>
+    </w:p>
+    <w:p>
+      <w:pPr>
+        <w:pStyle w:val="ListNumber"/>
+      </w:pPr>
+      <w:r>
+        <w:t>Re-import into fresh V2 index</w:t>
+      </w:r>
+    </w:p>
+    <w:p>
+      <w:pPr>
+        <w:pStyle w:val="ListNumber"/>
+      </w:pPr>
+      <w:r>
+        <w:t>Re-run QA on the rebuilt corpus</w:t>
+      </w:r>
+    </w:p>
+    <w:p>
+      <w:pPr>
+        <w:pStyle w:val="ListNumber"/>
+      </w:pPr>
+      <w:r>
+        <w:t>Only then return to latency and polish work</w:t>
       </w:r>
     </w:p>
     <w:p/>
@@ -817,46 +1164,18 @@
     <w:p/>
     <w:p>
       <w:r>
-        <w:t>Do not reopen correctness churn while latency and operator workflow remain the real bottlenecks.</w:t>
+        <w:t>Do not spend more time optimizing the wrong corpus.</w:t>
       </w:r>
     </w:p>
     <w:p/>
     <w:p>
       <w:r>
-        <w:t>The system is now functionally green. The next four sprints should focus on:</w:t>
-      </w:r>
-    </w:p>
-    <w:p/>
-    <w:p>
-      <w:pPr>
-        <w:pStyle w:val="ListBullet"/>
-      </w:pPr>
-      <w:r>
-        <w:t>faster steady-state operation</w:t>
+        <w:t>The next real win is not shaving milliseconds off the current inflated index.</w:t>
       </w:r>
     </w:p>
     <w:p>
-      <w:pPr>
-        <w:pStyle w:val="ListBullet"/>
-      </w:pPr>
       <w:r>
-        <w:t>broader structured coverage</w:t>
-      </w:r>
-    </w:p>
-    <w:p>
-      <w:pPr>
-        <w:pStyle w:val="ListBullet"/>
-      </w:pPr>
-      <w:r>
-        <w:t>better QA diagnostics</w:t>
-      </w:r>
-    </w:p>
-    <w:p>
-      <w:pPr>
-        <w:pStyle w:val="ListBullet"/>
-      </w:pPr>
-      <w:r>
-        <w:t>repeatable operator startup and demo readiness</w:t>
+        <w:t>The next real win is rebuilding from a cleaner source set so every downstream stage becomes cheaper.</w:t>
       </w:r>
     </w:p>
     <w:p/>

</xml_diff>